<commit_message>
Version 5 (kleiner Fehler bereinigt)
</commit_message>
<xml_diff>
--- a/Merkblätter/Merkblatt_Prüflinge_KB-BFL.docx
+++ b/Merkblätter/Merkblatt_Prüflinge_KB-BFL.docx
@@ -155,7 +155,13 @@
         <w:t xml:space="preserve">Die Prüfung findet in einem Examenskurs auf der Moodle-Plattform des Kompetenzzentrums Digitale Barrierefreiheit statt. </w:t>
       </w:r>
       <w:r>
-        <w:t xml:space="preserve">Registrieren Sie sich vorab auf der Moodle-Plattform auf </w:t>
+        <w:t xml:space="preserve">Registrieren Sie sich </w:t>
+      </w:r>
+      <w:r>
+        <w:t xml:space="preserve">kostenlos </w:t>
+      </w:r>
+      <w:r>
+        <w:t xml:space="preserve">vorab auf der Moodle-Plattform auf </w:t>
       </w:r>
       <w:hyperlink r:id="rId9" w:tooltip="https://mooc.hdm-stuttgart.de" w:history="1">
         <w:r>
@@ -169,18 +175,10 @@
         <w:t xml:space="preserve"> </w:t>
       </w:r>
       <w:r>
-        <w:t xml:space="preserve">mit Ihrer persönlichen </w:t>
-      </w:r>
-      <w:proofErr w:type="gramStart"/>
-      <w:r>
-        <w:t>Email</w:t>
-      </w:r>
-      <w:proofErr w:type="gramEnd"/>
-      <w:r>
-        <w:t xml:space="preserve"> </w:t>
+        <w:t>mit Ihrer persönlichen Email</w:t>
       </w:r>
       <w:r>
-        <w:t>(kostenlose Registrierung).</w:t>
+        <w:t>.</w:t>
       </w:r>
       <w:r>
         <w:t xml:space="preserve"> </w:t>
@@ -775,15 +773,7 @@
         <w:t xml:space="preserve">Nach erfolgreichem Bestehen der Prüfung können Sie sich Ihre schriftliche Bescheinigung zum Knowledge Badge direkt im Examenskurs herunterladen. </w:t>
       </w:r>
       <w:r>
-        <w:t xml:space="preserve">Zusätzlich bekommen Sie das Knowledge Badge auch per </w:t>
-      </w:r>
-      <w:proofErr w:type="gramStart"/>
-      <w:r>
-        <w:t>Email</w:t>
-      </w:r>
-      <w:proofErr w:type="gramEnd"/>
-      <w:r>
-        <w:t xml:space="preserve"> zugesandt.</w:t>
+        <w:t>Zusätzlich bekommen Sie das Knowledge Badge auch per Email zugesandt.</w:t>
       </w:r>
     </w:p>
     <w:p>

</xml_diff>